<commit_message>
redacted personal information from usability study participants
</commit_message>
<xml_diff>
--- a/usability_study/Group_3_Usability_Study.docx
+++ b/usability_study/Group_3_Usability_Study.docx
@@ -1824,7 +1824,13 @@
         <w:rPr>
           <w:color w:val="1B1E23"/>
         </w:rPr>
-        <w:t>Michel Chen, Research Chemist</w:t>
+        <w:t xml:space="preserve">Michel, </w:t>
+      </w:r>
+      <w:r>
+        <w:rPr>
+          <w:color w:val="1B1E23"/>
+        </w:rPr>
+        <w:t>[occupation redacted]</w:t>
       </w:r>
     </w:p>
     <w:p>
@@ -1842,7 +1848,13 @@
         <w:rPr>
           <w:color w:val="1B1E23"/>
         </w:rPr>
-        <w:t>Tiffany Gonzales, RN and Activist</w:t>
+        <w:t xml:space="preserve">Tiffany, </w:t>
+      </w:r>
+      <w:r>
+        <w:rPr>
+          <w:color w:val="1B1E23"/>
+        </w:rPr>
+        <w:t>[occupation redacted]</w:t>
       </w:r>
     </w:p>
     <w:p>
@@ -1860,7 +1872,13 @@
         <w:rPr>
           <w:color w:val="1B1E23"/>
         </w:rPr>
-        <w:t>Jan Glaser, CPA</w:t>
+        <w:t xml:space="preserve">Jan, </w:t>
+      </w:r>
+      <w:r>
+        <w:rPr>
+          <w:color w:val="1B1E23"/>
+        </w:rPr>
+        <w:t>[occupation redacted]</w:t>
       </w:r>
     </w:p>
     <w:p>
@@ -1878,7 +1896,13 @@
         <w:rPr>
           <w:color w:val="1B1E23"/>
         </w:rPr>
-        <w:t>Joel, TSA Security</w:t>
+        <w:t xml:space="preserve">Joel, </w:t>
+      </w:r>
+      <w:r>
+        <w:rPr>
+          <w:color w:val="1B1E23"/>
+        </w:rPr>
+        <w:t>[occupation redacted]</w:t>
       </w:r>
     </w:p>
     <w:p>
@@ -1896,7 +1920,13 @@
         <w:rPr>
           <w:color w:val="1B1E23"/>
         </w:rPr>
-        <w:t>Brian, Contractor</w:t>
+        <w:t xml:space="preserve">Brian, </w:t>
+      </w:r>
+      <w:r>
+        <w:rPr>
+          <w:color w:val="1B1E23"/>
+        </w:rPr>
+        <w:t>[occupation redacted]</w:t>
       </w:r>
     </w:p>
     <w:p>
@@ -1914,7 +1944,13 @@
         <w:rPr>
           <w:color w:val="1B1E23"/>
         </w:rPr>
-        <w:t>Aurelia, Primary School Teacher</w:t>
+        <w:t xml:space="preserve">Aurelia, </w:t>
+      </w:r>
+      <w:r>
+        <w:rPr>
+          <w:color w:val="1B1E23"/>
+        </w:rPr>
+        <w:t>[occupation redacted]</w:t>
       </w:r>
     </w:p>
     <w:p>
@@ -1932,7 +1968,13 @@
         <w:rPr>
           <w:color w:val="1B1E23"/>
         </w:rPr>
-        <w:t>Vanessa, HR Specialist</w:t>
+        <w:t xml:space="preserve">Vanessa, </w:t>
+      </w:r>
+      <w:r>
+        <w:rPr>
+          <w:color w:val="1B1E23"/>
+        </w:rPr>
+        <w:t>[occupation redacted]</w:t>
       </w:r>
     </w:p>
     <w:p>
@@ -1950,7 +1992,13 @@
         <w:rPr>
           <w:color w:val="1B1E23"/>
         </w:rPr>
-        <w:t>Zi, Graduate School Student</w:t>
+        <w:t xml:space="preserve">Zi, </w:t>
+      </w:r>
+      <w:r>
+        <w:rPr>
+          <w:color w:val="1B1E23"/>
+        </w:rPr>
+        <w:t>[occupation redacted]</w:t>
       </w:r>
     </w:p>
     <w:p>
@@ -1968,7 +2016,13 @@
         <w:rPr>
           <w:color w:val="1B1E23"/>
         </w:rPr>
-        <w:t>Megan, Software Engineer</w:t>
+        <w:t xml:space="preserve">Megan, </w:t>
+      </w:r>
+      <w:r>
+        <w:rPr>
+          <w:color w:val="1B1E23"/>
+        </w:rPr>
+        <w:t>[occupation redacted]</w:t>
       </w:r>
     </w:p>
     <w:p>
@@ -1987,7 +2041,13 @@
         <w:rPr>
           <w:color w:val="1B1E23"/>
         </w:rPr>
-        <w:t>Andres, Program Manager</w:t>
+        <w:t xml:space="preserve">Andres, </w:t>
+      </w:r>
+      <w:r>
+        <w:rPr>
+          <w:color w:val="1B1E23"/>
+        </w:rPr>
+        <w:t>[occupation redacted]</w:t>
       </w:r>
     </w:p>
     <w:p>

</xml_diff>